<commit_message>
Update report: 10 pages, renamed dashboard, added Inference & Discussion
</commit_message>
<xml_diff>
--- a/Group52_Report.docx
+++ b/Group52_Report.docx
@@ -98,7 +98,7 @@
           <w:i w:val="0"/>
           <w:sz w:val="22"/>
         </w:rPr>
-        <w:t>The Streamlit application exposes nine navigation pages accessible from the sidebar:</w:t>
+        <w:t>The Streamlit application exposes ten navigation pages accessible from the sidebar:</w:t>
       </w:r>
     </w:p>
     <w:p>
@@ -106,7 +106,7 @@
         <w:pStyle w:val="ListBullet"/>
       </w:pPr>
       <w:r>
-        <w:t>Dashboard – KPI metrics, document length distribution, vocabulary frequency chart, recent search history, full corpus table.</w:t>
+        <w:t>IR Dashboard (Group 52) – KPI metrics, document length distribution, vocabulary frequency chart, recent search history, full corpus table.</w:t>
       </w:r>
     </w:p>
     <w:p>
@@ -171,6 +171,14 @@
       </w:pPr>
       <w:r>
         <w:t>Performance Analytics – Corpus/index KPIs, timing metrics, crawl statistics, document-length histogram, depth distribution, search latency chart, mode-usage pie chart.</w:t>
+      </w:r>
+    </w:p>
+    <w:p>
+      <w:pPr>
+        <w:pStyle w:val="ListBullet"/>
+      </w:pPr>
+      <w:r>
+        <w:t>Inference &amp; Discussion – Compulsory analysis answers to all 5 questions.</w:t>
       </w:r>
     </w:p>
     <w:p>
@@ -2649,7 +2657,7 @@
           </w:tcPr>
           <w:p>
             <w:r>
-              <w:t>app.py (1425 lines)</w:t>
+              <w:t>app.py (1,975 lines)</w:t>
             </w:r>
           </w:p>
         </w:tc>
@@ -2958,6 +2966,8 @@
       </w:pPr>
       <w:r>
         <w:t>Step 6: Open Performance Analytics to review system KPIs.</w:t>
+        <w:br/>
+        <w:t>Step 7: Open Inference &amp; Discussion for compulsory analysis answers.</w:t>
       </w:r>
     </w:p>
     <w:p>

</xml_diff>